<commit_message>
recover execution internal economic reality
</commit_message>
<xml_diff>
--- a/docs/DOC-034 — Execution Capability.docx
+++ b/docs/DOC-034 — Execution Capability.docx
@@ -109,7 +109,7 @@
         <w:rPr>
           <w:rtl w:val="0"/>
         </w:rPr>
-        <w:t xml:space="preserve">Versión: 1.1</w:t>
+        <w:t xml:space="preserve">Versión: 1.3</w:t>
       </w:r>
     </w:p>
     <w:p>
@@ -371,6 +371,17 @@
           <w:rtl w:val="0"/>
         </w:rPr>
         <w:t xml:space="preserve">- DOC-038 / IT-038-001 — Operational Materialization</w:t>
+      </w:r>
+    </w:p>
+    <w:p>
+      <w:pPr>
+        <w:rPr/>
+      </w:pPr>
+      <w:r>
+        <w:rPr>
+          <w:rtl w:val="0"/>
+        </w:rPr>
+        <w:t xml:space="preserve">- DOC-041 / IT-041-001 — External Economic Observation Contract</w:t>
       </w:r>
     </w:p>
     <w:p>
@@ -3424,7 +3435,49 @@
         <w:rPr>
           <w:rtl w:val="0"/>
         </w:rPr>
-        <w:t xml:space="preserve">Los documentos posteriores relacionados con observación externa, estado interno y comparación deberán evaluarse en el ciclo de recuperación de Reconciliation contra este ownership.</w:t>
+        <w:t xml:space="preserve">DOC-041 / IT-041-001 ha sido recuperado contra este ownership. ExternallyObservedEconomicReality es desde este cierre un contrato público de Reconciliation propiedad de CAP-007 que representa exclusivamente la realidad económica afirmada por una autoridad externa, preservando autoridad, temporalidad, coverage, explicit-zero/absence y provenance sin realizar todavía comparación interna/externa.</w:t>
+      </w:r>
+    </w:p>
+    <w:p>
+      <w:pPr>
+        <w:rPr/>
+      </w:pPr>
+      <w:r>
+        <w:rPr>
+          <w:rtl w:val="0"/>
+        </w:rPr>
+      </w:r>
+    </w:p>
+    <w:p>
+      <w:pPr>
+        <w:rPr/>
+      </w:pPr>
+      <w:r>
+        <w:rPr>
+          <w:rtl w:val="0"/>
+        </w:rPr>
+        <w:t xml:space="preserve">La existencia física de external_economic_observation como package separado no crea una Capability peer ni obliga a una dependencia física hacia quant_platform.execution.</w:t>
+      </w:r>
+    </w:p>
+    <w:p>
+      <w:pPr>
+        <w:rPr/>
+      </w:pPr>
+      <w:r>
+        <w:rPr>
+          <w:rtl w:val="0"/>
+        </w:rPr>
+      </w:r>
+    </w:p>
+    <w:p>
+      <w:pPr>
+        <w:rPr/>
+      </w:pPr>
+      <w:r>
+        <w:rPr>
+          <w:rtl w:val="0"/>
+        </w:rPr>
+        <w:t xml:space="preserve">Los documentos posteriores relacionados con estado interno y comparación deberán continuar evaluándose secuencialmente contra este ownership.</w:t>
       </w:r>
     </w:p>
     <w:p>
@@ -4155,7 +4208,18 @@
         <w:rPr>
           <w:rtl w:val="0"/>
         </w:rPr>
-        <w:t xml:space="preserve">- contratos de reconciliación cuando se implemente ese incremento.</w:t>
+        <w:t xml:space="preserve">- ExternallyObservedEconomicReality y sus contratos constitutivos de autoridad, temporalidad, coverage, assertions y provenance como primer contrato fuente externo de Reconciliation;</w:t>
+      </w:r>
+    </w:p>
+    <w:p>
+      <w:pPr>
+        <w:rPr/>
+      </w:pPr>
+      <w:r>
+        <w:rPr>
+          <w:rtl w:val="0"/>
+        </w:rPr>
+        <w:t xml:space="preserve">- contratos adicionales de Reconciliation cuando se recuperen los tramos de realidad interna, comparación, órdenes y ejecuciones.</w:t>
       </w:r>
     </w:p>
     <w:p>
@@ -4831,6 +4895,27 @@
         <w:rPr>
           <w:rtl w:val="0"/>
         </w:rPr>
+        <w:t xml:space="preserve">DOC-041 deja igualmente de representar una Capability sistémica independiente. Su contrato ExternallyObservedEconomicReality y sus invariantes válidas se preservan como responsabilidad subordinada de Reconciliation dentro de CAP-007 conforme a DOC-041 v1.1 / IT-041-001 v1.1.</w:t>
+      </w:r>
+    </w:p>
+    <w:p>
+      <w:pPr>
+        <w:rPr/>
+      </w:pPr>
+      <w:r>
+        <w:rPr>
+          <w:rtl w:val="0"/>
+        </w:rPr>
+      </w:r>
+    </w:p>
+    <w:p>
+      <w:pPr>
+        <w:rPr/>
+      </w:pPr>
+      <w:r>
+        <w:rPr>
+          <w:rtl w:val="0"/>
+        </w:rPr>
         <w:t xml:space="preserve">DOC-034 permanece como documento arquitectónico rector de la Capability.</w:t>
       </w:r>
     </w:p>
@@ -4867,13 +4952,15 @@
     </w:p>
     <w:p>
       <w:pPr>
-        <w:pStyle w:val="Heading2"/>
-        <w:rPr/>
-      </w:pPr>
-      <w:bookmarkStart w:colFirst="0" w:colLast="0" w:name="_17z6ny1x1zao" w:id="31"/>
-      <w:bookmarkEnd w:id="31"/>
-      <w:r>
-        <w:rPr>
+        <w:rPr>
+          <w:sz w:val="32"/>
+          <w:szCs w:val="32"/>
+        </w:rPr>
+      </w:pPr>
+      <w:r>
+        <w:rPr>
+          <w:sz w:val="32"/>
+          <w:szCs w:val="32"/>
           <w:rtl w:val="0"/>
         </w:rPr>
         <w:t xml:space="preserve">29. Siguiente unidad demostrada</w:t>
@@ -4881,100 +4968,78 @@
     </w:p>
     <w:p>
       <w:pPr>
-        <w:rPr/>
-      </w:pPr>
-      <w:r>
-        <w:rPr>
-          <w:rtl w:val="0"/>
-        </w:rPr>
-        <w:t xml:space="preserve">La siguiente unidad de trabajo dentro de Ciclo 3 es recuperar el primer tramo implementable de Execution:</w:t>
-      </w:r>
-    </w:p>
-    <w:p>
-      <w:pPr>
-        <w:rPr/>
-      </w:pPr>
-      <w:r>
-        <w:rPr>
-          <w:rtl w:val="0"/>
-        </w:rPr>
-      </w:r>
-    </w:p>
-    <w:p>
-      <w:pPr>
-        <w:rPr/>
-      </w:pPr>
-      <w:r>
-        <w:rPr>
-          <w:rtl w:val="0"/>
-        </w:rPr>
-        <w:t xml:space="preserve">Target PortfolioState</w:t>
-      </w:r>
-    </w:p>
-    <w:p>
-      <w:pPr>
-        <w:rPr/>
-      </w:pPr>
-      <w:r>
-        <w:rPr>
-          <w:rFonts w:ascii="Arial Unicode MS" w:cs="Arial Unicode MS" w:eastAsia="Arial Unicode MS" w:hAnsi="Arial Unicode MS"/>
-          <w:rtl w:val="0"/>
-        </w:rPr>
-        <w:t xml:space="preserve">→ determinación operacional trazable</w:t>
-      </w:r>
-    </w:p>
-    <w:p>
-      <w:pPr>
-        <w:rPr/>
-      </w:pPr>
-      <w:r>
-        <w:rPr>
-          <w:rFonts w:ascii="Arial Unicode MS" w:cs="Arial Unicode MS" w:eastAsia="Arial Unicode MS" w:hAnsi="Arial Unicode MS"/>
-          <w:rtl w:val="0"/>
-        </w:rPr>
-        <w:t xml:space="preserve">→ contrato preparado para la frontera de presentación externa</w:t>
-      </w:r>
-    </w:p>
-    <w:p>
-      <w:pPr>
-        <w:rPr/>
-      </w:pPr>
-      <w:r>
-        <w:rPr>
-          <w:rtl w:val="0"/>
-        </w:rPr>
-      </w:r>
-    </w:p>
-    <w:p>
-      <w:pPr>
-        <w:rPr/>
-      </w:pPr>
-      <w:r>
-        <w:rPr>
-          <w:rtl w:val="0"/>
-        </w:rPr>
-        <w:t xml:space="preserve">El incremento deberá reutilizar la semántica válida de InvestmentOperation, OperationalIntent y OperationalRequest, eliminar PortfolioTransition como dependencia pública obligatoria y preservar los límites operacionales originados por Risk.</w:t>
-      </w:r>
-    </w:p>
-    <w:p>
-      <w:pPr>
-        <w:rPr/>
-      </w:pPr>
-      <w:r>
-        <w:rPr>
-          <w:rtl w:val="0"/>
-        </w:rPr>
-      </w:r>
-    </w:p>
-    <w:p>
-      <w:pPr>
-        <w:rPr/>
-      </w:pPr>
-      <w:r>
-        <w:rPr>
-          <w:rtl w:val="0"/>
-        </w:rPr>
-        <w:t xml:space="preserve">No debe intentar implementar en el mismo incremento Submission, Admission, Materialization, Reconciliation ni limpieza física completa.</w:t>
+        <w:rPr>
+          <w:sz w:val="32"/>
+          <w:szCs w:val="32"/>
+        </w:rPr>
+      </w:pPr>
+      <w:r>
+        <w:rPr>
+          <w:sz w:val="32"/>
+          <w:szCs w:val="32"/>
+          <w:rtl w:val="0"/>
+        </w:rPr>
+        <w:t xml:space="preserve">El tramo externo de Reconciliation para posiciones y efectivo queda arquitectónicamente recuperado mediante DOC-041 / IT-041-001.</w:t>
+      </w:r>
+    </w:p>
+    <w:p>
+      <w:pPr>
+        <w:rPr>
+          <w:sz w:val="32"/>
+          <w:szCs w:val="32"/>
+        </w:rPr>
+      </w:pPr>
+      <w:r>
+        <w:rPr>
+          <w:rtl w:val="0"/>
+        </w:rPr>
+      </w:r>
+    </w:p>
+    <w:p>
+      <w:pPr>
+        <w:rPr>
+          <w:sz w:val="32"/>
+          <w:szCs w:val="32"/>
+        </w:rPr>
+      </w:pPr>
+      <w:r>
+        <w:rPr>
+          <w:sz w:val="32"/>
+          <w:szCs w:val="32"/>
+          <w:rtl w:val="0"/>
+        </w:rPr>
+        <w:t xml:space="preserve">DOC-042 / IT-042-001 quedan recuperados como responsabilidad de Reconciliation dentro de CAP-007: InternalEconomicReality afirma qué PortfolioState constituye la realidad económica interna para un instante económico determinado, preservando ownership de Portfolio y sin realizar todavía comparación, Verification ni resolution. La siguiente unidad necesaria es DOC-043 / IT-043-001 para recuperar el contraste entre InternalEconomicReality y ExternallyObservedEconomicReality como incremento de Reconciliation.</w:t>
+      </w:r>
+    </w:p>
+    <w:p>
+      <w:pPr>
+        <w:rPr>
+          <w:sz w:val="32"/>
+          <w:szCs w:val="32"/>
+        </w:rPr>
+      </w:pPr>
+      <w:r>
+        <w:rPr>
+          <w:rtl w:val="0"/>
+        </w:rPr>
+      </w:r>
+    </w:p>
+    <w:p>
+      <w:pPr>
+        <w:rPr/>
+      </w:pPr>
+      <w:r>
+        <w:rPr>
+          <w:sz w:val="32"/>
+          <w:szCs w:val="32"/>
+          <w:rtl w:val="0"/>
+        </w:rPr>
+        <w:t xml:space="preserve">IT-043-001 permanece fuera de recuperación hasta cerrar 042. No se abrirán en este ciclo reconciliación de órdenes/ejecuciones, resolución de discrepancias, corrección ni limpieza física.</w:t>
+      </w:r>
+      <w:r>
+        <w:rPr>
+          <w:rtl w:val="0"/>
+        </w:rPr>
       </w:r>
     </w:p>
     <w:p>

</xml_diff>